<commit_message>
HyG 1.º v1.2 en oficio con solucionario; portadas de solucionarios corregidas
Tomo v1.2 (111 págs., índice poblado) y Solucionario v1.2 (29 págs.) pasados por
el pipeline oficio; 162/162 opciones múltiples coherentes entre tomo y solucionario.
Errata «pocos familias» corregida. Portadas: solucionario de 2.º sin lema heredado ni
leyenda del estudiante; duplicados quitados en 3.º y 7.º.

Co-Authored-By: Claude Opus 5.5 <noreply@anthropic.com>
Claude-Session: https://claude.ai/code/session_01PbDYVu4FEEwhgunWWJfqB4
</commit_message>
<xml_diff>
--- a/Pedido_2026-10-03_Edicion_Oficio/02_HyG_7mo_Grado/Historia_y_Geografia_7mo_SOLUCIONARIO_DOCENTE.docx
+++ b/Pedido_2026-10-03_Edicion_Oficio/02_HyG_7mo_Grado/Historia_y_Geografia_7mo_SOLUCIONARIO_DOCENTE.docx
@@ -109,20 +109,6 @@
       </w:r>
     </w:p>
     <w:p/>
-    <w:p>
-      <w:pPr>
-        <w:jc w:val="center"/>
-      </w:pPr>
-      <w:r>
-        <w:rPr>
-          <w:rFonts w:ascii="Arial" w:hAnsi="Arial"/>
-          <w:b/>
-          <w:color w:val="3D5A80"/>
-          <w:sz w:val="24"/>
-        </w:rPr>
-        <w:t>Solucionario · Material exclusivo del docente</w:t>
-      </w:r>
-    </w:p>
     <w:p/>
     <w:p/>
     <w:p/>

</xml_diff>